<commit_message>
REQ-005 batch 17 item 3: seventeen no-standard sections re-recorded under the obligation briefs; review pack at 90 of 90 real sections with no standard placeholder
One run, 18 calls, about $0.09 cached; sixteen first time. The service-role grants test now deletes every user it creates.

Co-Authored-By: Claude Fable 5.1 <noreply@anthropic.com>
</commit_message>
<xml_diff>
--- a/product/evidence/req-005/sole-trader/ai-and-digital-data-handling-procedure.docx
+++ b/product/evidence/req-005/sole-trader/ai-and-digital-data-handling-procedure.docx
@@ -431,20 +431,7 @@
           <w:sz w:val="22"/>
           <w:szCs w:val="22"/>
         </w:rPr>
-        <w:t xml:space="preserve">This procedure shows how Sunrise Supports removes names and details before we use any AI or digital tool.</w:t>
-      </w:r>
-    </w:p>
-    <w:p>
-      <w:pPr>
-        <w:spacing w:after="120"/>
-      </w:pPr>
-      <w:r>
-        <w:rPr>
-          <w:rFonts w:ascii="Calibri" w:cs="Calibri" w:eastAsia="Calibri" w:hAnsi="Calibri"/>
-          <w:sz w:val="22"/>
-          <w:szCs w:val="22"/>
-        </w:rPr>
-        <w:t xml:space="preserve">It supports the Commission's rules on keeping participant information private and safe.</w:t>
+        <w:t xml:space="preserve">This procedure shows how Sunrise Supports removes personal details before using any AI or digital tool. It supports the Commission's 2026 position that participant information is de-identified before any AI use.</w:t>
       </w:r>
     </w:p>
     <w:p>

</xml_diff>